<commit_message>
vault backup: 2026-04-27 22:38:47
</commit_message>
<xml_diff>
--- a/4 - Senior Year/Spring 2026/Gender/Final Paper/Sources/HW13_PhaseDiagram Practice.docx
+++ b/4 - Senior Year/Spring 2026/Gender/Final Paper/Sources/HW13_PhaseDiagram Practice.docx
@@ -99,7 +99,7 @@
           <w:sz w:val="24"/>
           <w:szCs w:val="24"/>
         </w:rPr>
-        <w:t xml:space="preserve">1. A 80 wt% Ni–20 wt% Cu alloy is slowly cooled from 1500°C to 1150°C. At what temperature does the first solid phase form? </w:t>
+        <w:t>1. A 80 wt% Ni–20 wt% Cu alloy is slowly cooled from 1500°C to 1150°C. At what temperature does the first solid phase form?</w:t>
       </w:r>
     </w:p>
     <w:p>
@@ -136,7 +136,7 @@
           <w:sz w:val="24"/>
           <w:szCs w:val="24"/>
         </w:rPr>
-        <w:t>2.  A 80 wt% Ni–20 wt% Cu alloy is slowly cooled from 1500°C to 1190°C. At the temperature that the first solid phase forms, what is the composition of the solid phase?</w:t>
+        <w:t xml:space="preserve">2.  A 80 wt% Ni–20 wt% Cu alloy is slowly cooled from 1500°C to 1190°C. At the temperature that the first solid phase forms, what is the composition of the solid phase? </w:t>
       </w:r>
     </w:p>
     <w:p>

</xml_diff>